<commit_message>
Adiciona preservação das revistas identificadas como OJS
</commit_message>
<xml_diff>
--- a/outputs/miguilim-preservacao-2026-10-29/documentacao/protocolo_reprodutibilidade_preservacao_ojs_2026-10-29.docx
+++ b/outputs/miguilim-preservacao-2026-10-29/documentacao/protocolo_reprodutibilidade_preservacao_ojs_2026-10-29.docx
@@ -948,6 +948,1230 @@
       <w:pPr>
         <w:spacing w:after="0"/>
       </w:pPr>
+    </w:p>
+    <w:p>
+      <w:r>
+        <w:br w:type="page"/>
+      </w:r>
+    </w:p>
+    <w:p>
+      <w:pPr>
+        <w:pStyle w:val="Heading2"/>
+        <w:keepNext/>
+      </w:pPr>
+      <w:r>
+        <w:t>2.1 Preservação entre as revistas identificadas como OJS</w:t>
+      </w:r>
+    </w:p>
+    <w:p>
+      <w:r>
+        <w:t>Considerando as categorias OJS declarado, confirmado tecnicamente e provável, 2.050 das 3.572 revistas estão preservadas, o equivalente a 57,4%.</w:t>
+      </w:r>
+    </w:p>
+    <w:tbl>
+      <w:tblPr>
+        <w:tblW w:type="auto" w:w="0"/>
+        <w:jc w:val="center"/>
+        <w:tblLayout w:type="fixed"/>
+        <w:tblLook w:firstColumn="1" w:firstRow="1" w:lastColumn="0" w:lastRow="0" w:noHBand="0" w:noVBand="1" w:val="04A0"/>
+      </w:tblPr>
+      <w:tblGrid>
+        <w:gridCol w:w="1958"/>
+        <w:gridCol w:w="1958"/>
+        <w:gridCol w:w="1958"/>
+        <w:gridCol w:w="1958"/>
+        <w:gridCol w:w="1958"/>
+      </w:tblGrid>
+      <w:tr>
+        <w:trPr>
+          <w:tblHeader w:val="true"/>
+        </w:trPr>
+        <w:tc>
+          <w:tcPr>
+            <w:tcW w:type="dxa" w:w="3816"/>
+            <w:shd w:fill="1F4E78"/>
+            <w:tcBorders>
+              <w:top w:val="single" w:sz="6" w:color="D9D9D9"/>
+              <w:left w:val="single" w:sz="6" w:color="D9D9D9"/>
+              <w:bottom w:val="single" w:sz="6" w:color="D9D9D9"/>
+              <w:right w:val="single" w:sz="6" w:color="D9D9D9"/>
+              <w:insideH w:val="single" w:sz="6" w:color="D9D9D9"/>
+              <w:insideV w:val="single" w:sz="6" w:color="D9D9D9"/>
+            </w:tcBorders>
+            <w:tcMar>
+              <w:top w:w="90" w:type="dxa"/>
+              <w:start w:w="110" w:type="dxa"/>
+              <w:bottom w:w="90" w:type="dxa"/>
+              <w:end w:w="110" w:type="dxa"/>
+            </w:tcMar>
+            <w:vAlign w:val="center"/>
+          </w:tcPr>
+          <w:p>
+            <w:pPr>
+              <w:jc w:val="center"/>
+            </w:pPr>
+            <w:r>
+              <w:rPr>
+                <w:b/>
+                <w:color w:val="FFFFFF"/>
+                <w:sz w:val="18"/>
+              </w:rPr>
+              <w:t>Classificação OJS</w:t>
+            </w:r>
+          </w:p>
+        </w:tc>
+        <w:tc>
+          <w:tcPr>
+            <w:tcW w:type="dxa" w:w="1224"/>
+            <w:shd w:fill="1F4E78"/>
+            <w:tcBorders>
+              <w:top w:val="single" w:sz="6" w:color="D9D9D9"/>
+              <w:left w:val="single" w:sz="6" w:color="D9D9D9"/>
+              <w:bottom w:val="single" w:sz="6" w:color="D9D9D9"/>
+              <w:right w:val="single" w:sz="6" w:color="D9D9D9"/>
+              <w:insideH w:val="single" w:sz="6" w:color="D9D9D9"/>
+              <w:insideV w:val="single" w:sz="6" w:color="D9D9D9"/>
+            </w:tcBorders>
+            <w:tcMar>
+              <w:top w:w="90" w:type="dxa"/>
+              <w:start w:w="110" w:type="dxa"/>
+              <w:bottom w:w="90" w:type="dxa"/>
+              <w:end w:w="110" w:type="dxa"/>
+            </w:tcMar>
+            <w:vAlign w:val="center"/>
+          </w:tcPr>
+          <w:p>
+            <w:pPr>
+              <w:jc w:val="center"/>
+            </w:pPr>
+            <w:r>
+              <w:rPr>
+                <w:b/>
+                <w:color w:val="FFFFFF"/>
+                <w:sz w:val="18"/>
+              </w:rPr>
+              <w:t>Total</w:t>
+            </w:r>
+          </w:p>
+        </w:tc>
+        <w:tc>
+          <w:tcPr>
+            <w:tcW w:type="dxa" w:w="1440"/>
+            <w:shd w:fill="1F4E78"/>
+            <w:tcBorders>
+              <w:top w:val="single" w:sz="6" w:color="D9D9D9"/>
+              <w:left w:val="single" w:sz="6" w:color="D9D9D9"/>
+              <w:bottom w:val="single" w:sz="6" w:color="D9D9D9"/>
+              <w:right w:val="single" w:sz="6" w:color="D9D9D9"/>
+              <w:insideH w:val="single" w:sz="6" w:color="D9D9D9"/>
+              <w:insideV w:val="single" w:sz="6" w:color="D9D9D9"/>
+            </w:tcBorders>
+            <w:tcMar>
+              <w:top w:w="90" w:type="dxa"/>
+              <w:start w:w="110" w:type="dxa"/>
+              <w:bottom w:w="90" w:type="dxa"/>
+              <w:end w:w="110" w:type="dxa"/>
+            </w:tcMar>
+            <w:vAlign w:val="center"/>
+          </w:tcPr>
+          <w:p>
+            <w:pPr>
+              <w:jc w:val="center"/>
+            </w:pPr>
+            <w:r>
+              <w:rPr>
+                <w:b/>
+                <w:color w:val="FFFFFF"/>
+                <w:sz w:val="18"/>
+              </w:rPr>
+              <w:t>Preservadas</w:t>
+            </w:r>
+          </w:p>
+        </w:tc>
+        <w:tc>
+          <w:tcPr>
+            <w:tcW w:type="dxa" w:w="1440"/>
+            <w:shd w:fill="1F4E78"/>
+            <w:tcBorders>
+              <w:top w:val="single" w:sz="6" w:color="D9D9D9"/>
+              <w:left w:val="single" w:sz="6" w:color="D9D9D9"/>
+              <w:bottom w:val="single" w:sz="6" w:color="D9D9D9"/>
+              <w:right w:val="single" w:sz="6" w:color="D9D9D9"/>
+              <w:insideH w:val="single" w:sz="6" w:color="D9D9D9"/>
+              <w:insideV w:val="single" w:sz="6" w:color="D9D9D9"/>
+            </w:tcBorders>
+            <w:tcMar>
+              <w:top w:w="90" w:type="dxa"/>
+              <w:start w:w="110" w:type="dxa"/>
+              <w:bottom w:w="90" w:type="dxa"/>
+              <w:end w:w="110" w:type="dxa"/>
+            </w:tcMar>
+            <w:vAlign w:val="center"/>
+          </w:tcPr>
+          <w:p>
+            <w:pPr>
+              <w:jc w:val="center"/>
+            </w:pPr>
+            <w:r>
+              <w:rPr>
+                <w:b/>
+                <w:color w:val="FFFFFF"/>
+                <w:sz w:val="18"/>
+              </w:rPr>
+              <w:t>% preservadas</w:t>
+            </w:r>
+          </w:p>
+        </w:tc>
+        <w:tc>
+          <w:tcPr>
+            <w:tcW w:type="dxa" w:w="1512"/>
+            <w:shd w:fill="1F4E78"/>
+            <w:tcBorders>
+              <w:top w:val="single" w:sz="6" w:color="D9D9D9"/>
+              <w:left w:val="single" w:sz="6" w:color="D9D9D9"/>
+              <w:bottom w:val="single" w:sz="6" w:color="D9D9D9"/>
+              <w:right w:val="single" w:sz="6" w:color="D9D9D9"/>
+              <w:insideH w:val="single" w:sz="6" w:color="D9D9D9"/>
+              <w:insideV w:val="single" w:sz="6" w:color="D9D9D9"/>
+            </w:tcBorders>
+            <w:tcMar>
+              <w:top w:w="90" w:type="dxa"/>
+              <w:start w:w="110" w:type="dxa"/>
+              <w:bottom w:w="90" w:type="dxa"/>
+              <w:end w:w="110" w:type="dxa"/>
+            </w:tcMar>
+            <w:vAlign w:val="center"/>
+          </w:tcPr>
+          <w:p>
+            <w:pPr>
+              <w:jc w:val="center"/>
+            </w:pPr>
+            <w:r>
+              <w:rPr>
+                <w:b/>
+                <w:color w:val="FFFFFF"/>
+                <w:sz w:val="18"/>
+              </w:rPr>
+              <w:t>2+ agências</w:t>
+            </w:r>
+          </w:p>
+        </w:tc>
+      </w:tr>
+      <w:tr>
+        <w:trPr>
+          <w:cantSplit w:val="true"/>
+        </w:trPr>
+        <w:tc>
+          <w:tcPr>
+            <w:tcW w:type="dxa" w:w="3816"/>
+            <w:tcBorders>
+              <w:top w:val="single" w:sz="6" w:color="D9D9D9"/>
+              <w:left w:val="single" w:sz="6" w:color="D9D9D9"/>
+              <w:bottom w:val="single" w:sz="6" w:color="D9D9D9"/>
+              <w:right w:val="single" w:sz="6" w:color="D9D9D9"/>
+              <w:insideH w:val="single" w:sz="6" w:color="D9D9D9"/>
+              <w:insideV w:val="single" w:sz="6" w:color="D9D9D9"/>
+            </w:tcBorders>
+            <w:tcMar>
+              <w:top w:w="90" w:type="dxa"/>
+              <w:start w:w="110" w:type="dxa"/>
+              <w:bottom w:w="90" w:type="dxa"/>
+              <w:end w:w="110" w:type="dxa"/>
+            </w:tcMar>
+            <w:vAlign w:val="center"/>
+          </w:tcPr>
+          <w:p>
+            <w:pPr>
+              <w:spacing w:after="0" w:line="252" w:lineRule="auto"/>
+              <w:jc w:val="left"/>
+            </w:pPr>
+            <w:r>
+              <w:rPr>
+                <w:sz w:val="18"/>
+              </w:rPr>
+              <w:t>OJS declarado no Miguilim</w:t>
+            </w:r>
+          </w:p>
+        </w:tc>
+        <w:tc>
+          <w:tcPr>
+            <w:tcW w:type="dxa" w:w="1224"/>
+            <w:tcBorders>
+              <w:top w:val="single" w:sz="6" w:color="D9D9D9"/>
+              <w:left w:val="single" w:sz="6" w:color="D9D9D9"/>
+              <w:bottom w:val="single" w:sz="6" w:color="D9D9D9"/>
+              <w:right w:val="single" w:sz="6" w:color="D9D9D9"/>
+              <w:insideH w:val="single" w:sz="6" w:color="D9D9D9"/>
+              <w:insideV w:val="single" w:sz="6" w:color="D9D9D9"/>
+            </w:tcBorders>
+            <w:tcMar>
+              <w:top w:w="90" w:type="dxa"/>
+              <w:start w:w="110" w:type="dxa"/>
+              <w:bottom w:w="90" w:type="dxa"/>
+              <w:end w:w="110" w:type="dxa"/>
+            </w:tcMar>
+            <w:vAlign w:val="center"/>
+          </w:tcPr>
+          <w:p>
+            <w:pPr>
+              <w:spacing w:after="0" w:line="252" w:lineRule="auto"/>
+              <w:jc w:val="left"/>
+            </w:pPr>
+            <w:r>
+              <w:rPr>
+                <w:sz w:val="18"/>
+              </w:rPr>
+              <w:t>1.919</w:t>
+            </w:r>
+          </w:p>
+        </w:tc>
+        <w:tc>
+          <w:tcPr>
+            <w:tcW w:type="dxa" w:w="1440"/>
+            <w:tcBorders>
+              <w:top w:val="single" w:sz="6" w:color="D9D9D9"/>
+              <w:left w:val="single" w:sz="6" w:color="D9D9D9"/>
+              <w:bottom w:val="single" w:sz="6" w:color="D9D9D9"/>
+              <w:right w:val="single" w:sz="6" w:color="D9D9D9"/>
+              <w:insideH w:val="single" w:sz="6" w:color="D9D9D9"/>
+              <w:insideV w:val="single" w:sz="6" w:color="D9D9D9"/>
+            </w:tcBorders>
+            <w:tcMar>
+              <w:top w:w="90" w:type="dxa"/>
+              <w:start w:w="110" w:type="dxa"/>
+              <w:bottom w:w="90" w:type="dxa"/>
+              <w:end w:w="110" w:type="dxa"/>
+            </w:tcMar>
+            <w:vAlign w:val="center"/>
+          </w:tcPr>
+          <w:p>
+            <w:pPr>
+              <w:spacing w:after="0" w:line="252" w:lineRule="auto"/>
+              <w:jc w:val="left"/>
+            </w:pPr>
+            <w:r>
+              <w:rPr>
+                <w:sz w:val="18"/>
+              </w:rPr>
+              <w:t>1.161</w:t>
+            </w:r>
+          </w:p>
+        </w:tc>
+        <w:tc>
+          <w:tcPr>
+            <w:tcW w:type="dxa" w:w="1440"/>
+            <w:tcBorders>
+              <w:top w:val="single" w:sz="6" w:color="D9D9D9"/>
+              <w:left w:val="single" w:sz="6" w:color="D9D9D9"/>
+              <w:bottom w:val="single" w:sz="6" w:color="D9D9D9"/>
+              <w:right w:val="single" w:sz="6" w:color="D9D9D9"/>
+              <w:insideH w:val="single" w:sz="6" w:color="D9D9D9"/>
+              <w:insideV w:val="single" w:sz="6" w:color="D9D9D9"/>
+            </w:tcBorders>
+            <w:tcMar>
+              <w:top w:w="90" w:type="dxa"/>
+              <w:start w:w="110" w:type="dxa"/>
+              <w:bottom w:w="90" w:type="dxa"/>
+              <w:end w:w="110" w:type="dxa"/>
+            </w:tcMar>
+            <w:vAlign w:val="center"/>
+          </w:tcPr>
+          <w:p>
+            <w:pPr>
+              <w:spacing w:after="0" w:line="252" w:lineRule="auto"/>
+              <w:jc w:val="left"/>
+            </w:pPr>
+            <w:r>
+              <w:rPr>
+                <w:sz w:val="18"/>
+              </w:rPr>
+              <w:t>60,5%</w:t>
+            </w:r>
+          </w:p>
+        </w:tc>
+        <w:tc>
+          <w:tcPr>
+            <w:tcW w:type="dxa" w:w="1512"/>
+            <w:tcBorders>
+              <w:top w:val="single" w:sz="6" w:color="D9D9D9"/>
+              <w:left w:val="single" w:sz="6" w:color="D9D9D9"/>
+              <w:bottom w:val="single" w:sz="6" w:color="D9D9D9"/>
+              <w:right w:val="single" w:sz="6" w:color="D9D9D9"/>
+              <w:insideH w:val="single" w:sz="6" w:color="D9D9D9"/>
+              <w:insideV w:val="single" w:sz="6" w:color="D9D9D9"/>
+            </w:tcBorders>
+            <w:tcMar>
+              <w:top w:w="90" w:type="dxa"/>
+              <w:start w:w="110" w:type="dxa"/>
+              <w:bottom w:w="90" w:type="dxa"/>
+              <w:end w:w="110" w:type="dxa"/>
+            </w:tcMar>
+            <w:vAlign w:val="center"/>
+          </w:tcPr>
+          <w:p>
+            <w:pPr>
+              <w:spacing w:after="0" w:line="252" w:lineRule="auto"/>
+              <w:jc w:val="left"/>
+            </w:pPr>
+            <w:r>
+              <w:rPr>
+                <w:sz w:val="18"/>
+              </w:rPr>
+              <w:t>305</w:t>
+            </w:r>
+          </w:p>
+        </w:tc>
+      </w:tr>
+      <w:tr>
+        <w:trPr>
+          <w:cantSplit w:val="true"/>
+        </w:trPr>
+        <w:tc>
+          <w:tcPr>
+            <w:tcW w:type="dxa" w:w="3816"/>
+            <w:tcBorders>
+              <w:top w:val="single" w:sz="6" w:color="D9D9D9"/>
+              <w:left w:val="single" w:sz="6" w:color="D9D9D9"/>
+              <w:bottom w:val="single" w:sz="6" w:color="D9D9D9"/>
+              <w:right w:val="single" w:sz="6" w:color="D9D9D9"/>
+              <w:insideH w:val="single" w:sz="6" w:color="D9D9D9"/>
+              <w:insideV w:val="single" w:sz="6" w:color="D9D9D9"/>
+            </w:tcBorders>
+            <w:tcMar>
+              <w:top w:w="90" w:type="dxa"/>
+              <w:start w:w="110" w:type="dxa"/>
+              <w:bottom w:w="90" w:type="dxa"/>
+              <w:end w:w="110" w:type="dxa"/>
+            </w:tcMar>
+            <w:shd w:fill="F2F2F2"/>
+            <w:vAlign w:val="center"/>
+          </w:tcPr>
+          <w:p>
+            <w:pPr>
+              <w:spacing w:after="0" w:line="252" w:lineRule="auto"/>
+              <w:jc w:val="left"/>
+            </w:pPr>
+            <w:r>
+              <w:rPr>
+                <w:sz w:val="18"/>
+              </w:rPr>
+              <w:t>OJS confirmado tecnicamente</w:t>
+            </w:r>
+          </w:p>
+        </w:tc>
+        <w:tc>
+          <w:tcPr>
+            <w:tcW w:type="dxa" w:w="1224"/>
+            <w:tcBorders>
+              <w:top w:val="single" w:sz="6" w:color="D9D9D9"/>
+              <w:left w:val="single" w:sz="6" w:color="D9D9D9"/>
+              <w:bottom w:val="single" w:sz="6" w:color="D9D9D9"/>
+              <w:right w:val="single" w:sz="6" w:color="D9D9D9"/>
+              <w:insideH w:val="single" w:sz="6" w:color="D9D9D9"/>
+              <w:insideV w:val="single" w:sz="6" w:color="D9D9D9"/>
+            </w:tcBorders>
+            <w:tcMar>
+              <w:top w:w="90" w:type="dxa"/>
+              <w:start w:w="110" w:type="dxa"/>
+              <w:bottom w:w="90" w:type="dxa"/>
+              <w:end w:w="110" w:type="dxa"/>
+            </w:tcMar>
+            <w:shd w:fill="F2F2F2"/>
+            <w:vAlign w:val="center"/>
+          </w:tcPr>
+          <w:p>
+            <w:pPr>
+              <w:spacing w:after="0" w:line="252" w:lineRule="auto"/>
+              <w:jc w:val="left"/>
+            </w:pPr>
+            <w:r>
+              <w:rPr>
+                <w:sz w:val="18"/>
+              </w:rPr>
+              <w:t>779</w:t>
+            </w:r>
+          </w:p>
+        </w:tc>
+        <w:tc>
+          <w:tcPr>
+            <w:tcW w:type="dxa" w:w="1440"/>
+            <w:tcBorders>
+              <w:top w:val="single" w:sz="6" w:color="D9D9D9"/>
+              <w:left w:val="single" w:sz="6" w:color="D9D9D9"/>
+              <w:bottom w:val="single" w:sz="6" w:color="D9D9D9"/>
+              <w:right w:val="single" w:sz="6" w:color="D9D9D9"/>
+              <w:insideH w:val="single" w:sz="6" w:color="D9D9D9"/>
+              <w:insideV w:val="single" w:sz="6" w:color="D9D9D9"/>
+            </w:tcBorders>
+            <w:tcMar>
+              <w:top w:w="90" w:type="dxa"/>
+              <w:start w:w="110" w:type="dxa"/>
+              <w:bottom w:w="90" w:type="dxa"/>
+              <w:end w:w="110" w:type="dxa"/>
+            </w:tcMar>
+            <w:shd w:fill="F2F2F2"/>
+            <w:vAlign w:val="center"/>
+          </w:tcPr>
+          <w:p>
+            <w:pPr>
+              <w:spacing w:after="0" w:line="252" w:lineRule="auto"/>
+              <w:jc w:val="left"/>
+            </w:pPr>
+            <w:r>
+              <w:rPr>
+                <w:sz w:val="18"/>
+              </w:rPr>
+              <w:t>335</w:t>
+            </w:r>
+          </w:p>
+        </w:tc>
+        <w:tc>
+          <w:tcPr>
+            <w:tcW w:type="dxa" w:w="1440"/>
+            <w:tcBorders>
+              <w:top w:val="single" w:sz="6" w:color="D9D9D9"/>
+              <w:left w:val="single" w:sz="6" w:color="D9D9D9"/>
+              <w:bottom w:val="single" w:sz="6" w:color="D9D9D9"/>
+              <w:right w:val="single" w:sz="6" w:color="D9D9D9"/>
+              <w:insideH w:val="single" w:sz="6" w:color="D9D9D9"/>
+              <w:insideV w:val="single" w:sz="6" w:color="D9D9D9"/>
+            </w:tcBorders>
+            <w:tcMar>
+              <w:top w:w="90" w:type="dxa"/>
+              <w:start w:w="110" w:type="dxa"/>
+              <w:bottom w:w="90" w:type="dxa"/>
+              <w:end w:w="110" w:type="dxa"/>
+            </w:tcMar>
+            <w:shd w:fill="F2F2F2"/>
+            <w:vAlign w:val="center"/>
+          </w:tcPr>
+          <w:p>
+            <w:pPr>
+              <w:spacing w:after="0" w:line="252" w:lineRule="auto"/>
+              <w:jc w:val="left"/>
+            </w:pPr>
+            <w:r>
+              <w:rPr>
+                <w:sz w:val="18"/>
+              </w:rPr>
+              <w:t>43,0%</w:t>
+            </w:r>
+          </w:p>
+        </w:tc>
+        <w:tc>
+          <w:tcPr>
+            <w:tcW w:type="dxa" w:w="1512"/>
+            <w:tcBorders>
+              <w:top w:val="single" w:sz="6" w:color="D9D9D9"/>
+              <w:left w:val="single" w:sz="6" w:color="D9D9D9"/>
+              <w:bottom w:val="single" w:sz="6" w:color="D9D9D9"/>
+              <w:right w:val="single" w:sz="6" w:color="D9D9D9"/>
+              <w:insideH w:val="single" w:sz="6" w:color="D9D9D9"/>
+              <w:insideV w:val="single" w:sz="6" w:color="D9D9D9"/>
+            </w:tcBorders>
+            <w:tcMar>
+              <w:top w:w="90" w:type="dxa"/>
+              <w:start w:w="110" w:type="dxa"/>
+              <w:bottom w:w="90" w:type="dxa"/>
+              <w:end w:w="110" w:type="dxa"/>
+            </w:tcMar>
+            <w:shd w:fill="F2F2F2"/>
+            <w:vAlign w:val="center"/>
+          </w:tcPr>
+          <w:p>
+            <w:pPr>
+              <w:spacing w:after="0" w:line="252" w:lineRule="auto"/>
+              <w:jc w:val="left"/>
+            </w:pPr>
+            <w:r>
+              <w:rPr>
+                <w:sz w:val="18"/>
+              </w:rPr>
+              <w:t>75</w:t>
+            </w:r>
+          </w:p>
+        </w:tc>
+      </w:tr>
+      <w:tr>
+        <w:trPr>
+          <w:cantSplit w:val="true"/>
+        </w:trPr>
+        <w:tc>
+          <w:tcPr>
+            <w:tcW w:type="dxa" w:w="3816"/>
+            <w:tcBorders>
+              <w:top w:val="single" w:sz="6" w:color="D9D9D9"/>
+              <w:left w:val="single" w:sz="6" w:color="D9D9D9"/>
+              <w:bottom w:val="single" w:sz="6" w:color="D9D9D9"/>
+              <w:right w:val="single" w:sz="6" w:color="D9D9D9"/>
+              <w:insideH w:val="single" w:sz="6" w:color="D9D9D9"/>
+              <w:insideV w:val="single" w:sz="6" w:color="D9D9D9"/>
+            </w:tcBorders>
+            <w:tcMar>
+              <w:top w:w="90" w:type="dxa"/>
+              <w:start w:w="110" w:type="dxa"/>
+              <w:bottom w:w="90" w:type="dxa"/>
+              <w:end w:w="110" w:type="dxa"/>
+            </w:tcMar>
+            <w:vAlign w:val="center"/>
+          </w:tcPr>
+          <w:p>
+            <w:pPr>
+              <w:spacing w:after="0" w:line="252" w:lineRule="auto"/>
+              <w:jc w:val="left"/>
+            </w:pPr>
+            <w:r>
+              <w:rPr>
+                <w:sz w:val="18"/>
+              </w:rPr>
+              <w:t>OJS provável por instalação compartilhada</w:t>
+            </w:r>
+          </w:p>
+        </w:tc>
+        <w:tc>
+          <w:tcPr>
+            <w:tcW w:type="dxa" w:w="1224"/>
+            <w:tcBorders>
+              <w:top w:val="single" w:sz="6" w:color="D9D9D9"/>
+              <w:left w:val="single" w:sz="6" w:color="D9D9D9"/>
+              <w:bottom w:val="single" w:sz="6" w:color="D9D9D9"/>
+              <w:right w:val="single" w:sz="6" w:color="D9D9D9"/>
+              <w:insideH w:val="single" w:sz="6" w:color="D9D9D9"/>
+              <w:insideV w:val="single" w:sz="6" w:color="D9D9D9"/>
+            </w:tcBorders>
+            <w:tcMar>
+              <w:top w:w="90" w:type="dxa"/>
+              <w:start w:w="110" w:type="dxa"/>
+              <w:bottom w:w="90" w:type="dxa"/>
+              <w:end w:w="110" w:type="dxa"/>
+            </w:tcMar>
+            <w:vAlign w:val="center"/>
+          </w:tcPr>
+          <w:p>
+            <w:pPr>
+              <w:spacing w:after="0" w:line="252" w:lineRule="auto"/>
+              <w:jc w:val="left"/>
+            </w:pPr>
+            <w:r>
+              <w:rPr>
+                <w:sz w:val="18"/>
+              </w:rPr>
+              <w:t>850</w:t>
+            </w:r>
+          </w:p>
+        </w:tc>
+        <w:tc>
+          <w:tcPr>
+            <w:tcW w:type="dxa" w:w="1440"/>
+            <w:tcBorders>
+              <w:top w:val="single" w:sz="6" w:color="D9D9D9"/>
+              <w:left w:val="single" w:sz="6" w:color="D9D9D9"/>
+              <w:bottom w:val="single" w:sz="6" w:color="D9D9D9"/>
+              <w:right w:val="single" w:sz="6" w:color="D9D9D9"/>
+              <w:insideH w:val="single" w:sz="6" w:color="D9D9D9"/>
+              <w:insideV w:val="single" w:sz="6" w:color="D9D9D9"/>
+            </w:tcBorders>
+            <w:tcMar>
+              <w:top w:w="90" w:type="dxa"/>
+              <w:start w:w="110" w:type="dxa"/>
+              <w:bottom w:w="90" w:type="dxa"/>
+              <w:end w:w="110" w:type="dxa"/>
+            </w:tcMar>
+            <w:vAlign w:val="center"/>
+          </w:tcPr>
+          <w:p>
+            <w:pPr>
+              <w:spacing w:after="0" w:line="252" w:lineRule="auto"/>
+              <w:jc w:val="left"/>
+            </w:pPr>
+            <w:r>
+              <w:rPr>
+                <w:sz w:val="18"/>
+              </w:rPr>
+              <w:t>551</w:t>
+            </w:r>
+          </w:p>
+        </w:tc>
+        <w:tc>
+          <w:tcPr>
+            <w:tcW w:type="dxa" w:w="1440"/>
+            <w:tcBorders>
+              <w:top w:val="single" w:sz="6" w:color="D9D9D9"/>
+              <w:left w:val="single" w:sz="6" w:color="D9D9D9"/>
+              <w:bottom w:val="single" w:sz="6" w:color="D9D9D9"/>
+              <w:right w:val="single" w:sz="6" w:color="D9D9D9"/>
+              <w:insideH w:val="single" w:sz="6" w:color="D9D9D9"/>
+              <w:insideV w:val="single" w:sz="6" w:color="D9D9D9"/>
+            </w:tcBorders>
+            <w:tcMar>
+              <w:top w:w="90" w:type="dxa"/>
+              <w:start w:w="110" w:type="dxa"/>
+              <w:bottom w:w="90" w:type="dxa"/>
+              <w:end w:w="110" w:type="dxa"/>
+            </w:tcMar>
+            <w:vAlign w:val="center"/>
+          </w:tcPr>
+          <w:p>
+            <w:pPr>
+              <w:spacing w:after="0" w:line="252" w:lineRule="auto"/>
+              <w:jc w:val="left"/>
+            </w:pPr>
+            <w:r>
+              <w:rPr>
+                <w:sz w:val="18"/>
+              </w:rPr>
+              <w:t>64,8%</w:t>
+            </w:r>
+          </w:p>
+        </w:tc>
+        <w:tc>
+          <w:tcPr>
+            <w:tcW w:type="dxa" w:w="1512"/>
+            <w:tcBorders>
+              <w:top w:val="single" w:sz="6" w:color="D9D9D9"/>
+              <w:left w:val="single" w:sz="6" w:color="D9D9D9"/>
+              <w:bottom w:val="single" w:sz="6" w:color="D9D9D9"/>
+              <w:right w:val="single" w:sz="6" w:color="D9D9D9"/>
+              <w:insideH w:val="single" w:sz="6" w:color="D9D9D9"/>
+              <w:insideV w:val="single" w:sz="6" w:color="D9D9D9"/>
+            </w:tcBorders>
+            <w:tcMar>
+              <w:top w:w="90" w:type="dxa"/>
+              <w:start w:w="110" w:type="dxa"/>
+              <w:bottom w:w="90" w:type="dxa"/>
+              <w:end w:w="110" w:type="dxa"/>
+            </w:tcMar>
+            <w:vAlign w:val="center"/>
+          </w:tcPr>
+          <w:p>
+            <w:pPr>
+              <w:spacing w:after="0" w:line="252" w:lineRule="auto"/>
+              <w:jc w:val="left"/>
+            </w:pPr>
+            <w:r>
+              <w:rPr>
+                <w:sz w:val="18"/>
+              </w:rPr>
+              <w:t>118</w:t>
+            </w:r>
+          </w:p>
+        </w:tc>
+      </w:tr>
+      <w:tr>
+        <w:trPr>
+          <w:cantSplit w:val="true"/>
+        </w:trPr>
+        <w:tc>
+          <w:tcPr>
+            <w:tcW w:type="dxa" w:w="3816"/>
+            <w:tcBorders>
+              <w:top w:val="single" w:sz="6" w:color="D9D9D9"/>
+              <w:left w:val="single" w:sz="6" w:color="D9D9D9"/>
+              <w:bottom w:val="single" w:sz="6" w:color="D9D9D9"/>
+              <w:right w:val="single" w:sz="6" w:color="D9D9D9"/>
+              <w:insideH w:val="single" w:sz="6" w:color="D9D9D9"/>
+              <w:insideV w:val="single" w:sz="6" w:color="D9D9D9"/>
+            </w:tcBorders>
+            <w:tcMar>
+              <w:top w:w="90" w:type="dxa"/>
+              <w:start w:w="110" w:type="dxa"/>
+              <w:bottom w:w="90" w:type="dxa"/>
+              <w:end w:w="110" w:type="dxa"/>
+            </w:tcMar>
+            <w:shd w:fill="F2F2F2"/>
+            <w:vAlign w:val="center"/>
+          </w:tcPr>
+          <w:p>
+            <w:pPr>
+              <w:spacing w:after="0" w:line="252" w:lineRule="auto"/>
+              <w:jc w:val="left"/>
+            </w:pPr>
+            <w:r>
+              <w:rPr>
+                <w:sz w:val="18"/>
+              </w:rPr>
+              <w:t>OJS provável por assinaturas técnicas</w:t>
+            </w:r>
+          </w:p>
+        </w:tc>
+        <w:tc>
+          <w:tcPr>
+            <w:tcW w:type="dxa" w:w="1224"/>
+            <w:tcBorders>
+              <w:top w:val="single" w:sz="6" w:color="D9D9D9"/>
+              <w:left w:val="single" w:sz="6" w:color="D9D9D9"/>
+              <w:bottom w:val="single" w:sz="6" w:color="D9D9D9"/>
+              <w:right w:val="single" w:sz="6" w:color="D9D9D9"/>
+              <w:insideH w:val="single" w:sz="6" w:color="D9D9D9"/>
+              <w:insideV w:val="single" w:sz="6" w:color="D9D9D9"/>
+            </w:tcBorders>
+            <w:tcMar>
+              <w:top w:w="90" w:type="dxa"/>
+              <w:start w:w="110" w:type="dxa"/>
+              <w:bottom w:w="90" w:type="dxa"/>
+              <w:end w:w="110" w:type="dxa"/>
+            </w:tcMar>
+            <w:shd w:fill="F2F2F2"/>
+            <w:vAlign w:val="center"/>
+          </w:tcPr>
+          <w:p>
+            <w:pPr>
+              <w:spacing w:after="0" w:line="252" w:lineRule="auto"/>
+              <w:jc w:val="left"/>
+            </w:pPr>
+            <w:r>
+              <w:rPr>
+                <w:sz w:val="18"/>
+              </w:rPr>
+              <w:t>24</w:t>
+            </w:r>
+          </w:p>
+        </w:tc>
+        <w:tc>
+          <w:tcPr>
+            <w:tcW w:type="dxa" w:w="1440"/>
+            <w:tcBorders>
+              <w:top w:val="single" w:sz="6" w:color="D9D9D9"/>
+              <w:left w:val="single" w:sz="6" w:color="D9D9D9"/>
+              <w:bottom w:val="single" w:sz="6" w:color="D9D9D9"/>
+              <w:right w:val="single" w:sz="6" w:color="D9D9D9"/>
+              <w:insideH w:val="single" w:sz="6" w:color="D9D9D9"/>
+              <w:insideV w:val="single" w:sz="6" w:color="D9D9D9"/>
+            </w:tcBorders>
+            <w:tcMar>
+              <w:top w:w="90" w:type="dxa"/>
+              <w:start w:w="110" w:type="dxa"/>
+              <w:bottom w:w="90" w:type="dxa"/>
+              <w:end w:w="110" w:type="dxa"/>
+            </w:tcMar>
+            <w:shd w:fill="F2F2F2"/>
+            <w:vAlign w:val="center"/>
+          </w:tcPr>
+          <w:p>
+            <w:pPr>
+              <w:spacing w:after="0" w:line="252" w:lineRule="auto"/>
+              <w:jc w:val="left"/>
+            </w:pPr>
+            <w:r>
+              <w:rPr>
+                <w:sz w:val="18"/>
+              </w:rPr>
+              <w:t>3</w:t>
+            </w:r>
+          </w:p>
+        </w:tc>
+        <w:tc>
+          <w:tcPr>
+            <w:tcW w:type="dxa" w:w="1440"/>
+            <w:tcBorders>
+              <w:top w:val="single" w:sz="6" w:color="D9D9D9"/>
+              <w:left w:val="single" w:sz="6" w:color="D9D9D9"/>
+              <w:bottom w:val="single" w:sz="6" w:color="D9D9D9"/>
+              <w:right w:val="single" w:sz="6" w:color="D9D9D9"/>
+              <w:insideH w:val="single" w:sz="6" w:color="D9D9D9"/>
+              <w:insideV w:val="single" w:sz="6" w:color="D9D9D9"/>
+            </w:tcBorders>
+            <w:tcMar>
+              <w:top w:w="90" w:type="dxa"/>
+              <w:start w:w="110" w:type="dxa"/>
+              <w:bottom w:w="90" w:type="dxa"/>
+              <w:end w:w="110" w:type="dxa"/>
+            </w:tcMar>
+            <w:shd w:fill="F2F2F2"/>
+            <w:vAlign w:val="center"/>
+          </w:tcPr>
+          <w:p>
+            <w:pPr>
+              <w:spacing w:after="0" w:line="252" w:lineRule="auto"/>
+              <w:jc w:val="left"/>
+            </w:pPr>
+            <w:r>
+              <w:rPr>
+                <w:sz w:val="18"/>
+              </w:rPr>
+              <w:t>12,5%</w:t>
+            </w:r>
+          </w:p>
+        </w:tc>
+        <w:tc>
+          <w:tcPr>
+            <w:tcW w:type="dxa" w:w="1512"/>
+            <w:tcBorders>
+              <w:top w:val="single" w:sz="6" w:color="D9D9D9"/>
+              <w:left w:val="single" w:sz="6" w:color="D9D9D9"/>
+              <w:bottom w:val="single" w:sz="6" w:color="D9D9D9"/>
+              <w:right w:val="single" w:sz="6" w:color="D9D9D9"/>
+              <w:insideH w:val="single" w:sz="6" w:color="D9D9D9"/>
+              <w:insideV w:val="single" w:sz="6" w:color="D9D9D9"/>
+            </w:tcBorders>
+            <w:tcMar>
+              <w:top w:w="90" w:type="dxa"/>
+              <w:start w:w="110" w:type="dxa"/>
+              <w:bottom w:w="90" w:type="dxa"/>
+              <w:end w:w="110" w:type="dxa"/>
+            </w:tcMar>
+            <w:shd w:fill="F2F2F2"/>
+            <w:vAlign w:val="center"/>
+          </w:tcPr>
+          <w:p>
+            <w:pPr>
+              <w:spacing w:after="0" w:line="252" w:lineRule="auto"/>
+              <w:jc w:val="left"/>
+            </w:pPr>
+            <w:r>
+              <w:rPr>
+                <w:sz w:val="18"/>
+              </w:rPr>
+              <w:t>1</w:t>
+            </w:r>
+          </w:p>
+        </w:tc>
+      </w:tr>
+      <w:tr>
+        <w:trPr>
+          <w:cantSplit w:val="true"/>
+        </w:trPr>
+        <w:tc>
+          <w:tcPr>
+            <w:tcW w:type="dxa" w:w="3816"/>
+            <w:tcBorders>
+              <w:top w:val="single" w:sz="6" w:color="D9D9D9"/>
+              <w:left w:val="single" w:sz="6" w:color="D9D9D9"/>
+              <w:bottom w:val="single" w:sz="6" w:color="D9D9D9"/>
+              <w:right w:val="single" w:sz="6" w:color="D9D9D9"/>
+              <w:insideH w:val="single" w:sz="6" w:color="D9D9D9"/>
+              <w:insideV w:val="single" w:sz="6" w:color="D9D9D9"/>
+            </w:tcBorders>
+            <w:tcMar>
+              <w:top w:w="90" w:type="dxa"/>
+              <w:start w:w="110" w:type="dxa"/>
+              <w:bottom w:w="90" w:type="dxa"/>
+              <w:end w:w="110" w:type="dxa"/>
+            </w:tcMar>
+            <w:vAlign w:val="center"/>
+          </w:tcPr>
+          <w:p>
+            <w:pPr>
+              <w:spacing w:after="0" w:line="252" w:lineRule="auto"/>
+              <w:jc w:val="left"/>
+            </w:pPr>
+            <w:r>
+              <w:rPr>
+                <w:sz w:val="18"/>
+              </w:rPr>
+              <w:t>Total identificado como OJS</w:t>
+            </w:r>
+          </w:p>
+        </w:tc>
+        <w:tc>
+          <w:tcPr>
+            <w:tcW w:type="dxa" w:w="1224"/>
+            <w:tcBorders>
+              <w:top w:val="single" w:sz="6" w:color="D9D9D9"/>
+              <w:left w:val="single" w:sz="6" w:color="D9D9D9"/>
+              <w:bottom w:val="single" w:sz="6" w:color="D9D9D9"/>
+              <w:right w:val="single" w:sz="6" w:color="D9D9D9"/>
+              <w:insideH w:val="single" w:sz="6" w:color="D9D9D9"/>
+              <w:insideV w:val="single" w:sz="6" w:color="D9D9D9"/>
+            </w:tcBorders>
+            <w:tcMar>
+              <w:top w:w="90" w:type="dxa"/>
+              <w:start w:w="110" w:type="dxa"/>
+              <w:bottom w:w="90" w:type="dxa"/>
+              <w:end w:w="110" w:type="dxa"/>
+            </w:tcMar>
+            <w:vAlign w:val="center"/>
+          </w:tcPr>
+          <w:p>
+            <w:pPr>
+              <w:spacing w:after="0" w:line="252" w:lineRule="auto"/>
+              <w:jc w:val="left"/>
+            </w:pPr>
+            <w:r>
+              <w:rPr>
+                <w:sz w:val="18"/>
+              </w:rPr>
+              <w:t>3.572</w:t>
+            </w:r>
+          </w:p>
+        </w:tc>
+        <w:tc>
+          <w:tcPr>
+            <w:tcW w:type="dxa" w:w="1440"/>
+            <w:tcBorders>
+              <w:top w:val="single" w:sz="6" w:color="D9D9D9"/>
+              <w:left w:val="single" w:sz="6" w:color="D9D9D9"/>
+              <w:bottom w:val="single" w:sz="6" w:color="D9D9D9"/>
+              <w:right w:val="single" w:sz="6" w:color="D9D9D9"/>
+              <w:insideH w:val="single" w:sz="6" w:color="D9D9D9"/>
+              <w:insideV w:val="single" w:sz="6" w:color="D9D9D9"/>
+            </w:tcBorders>
+            <w:tcMar>
+              <w:top w:w="90" w:type="dxa"/>
+              <w:start w:w="110" w:type="dxa"/>
+              <w:bottom w:w="90" w:type="dxa"/>
+              <w:end w:w="110" w:type="dxa"/>
+            </w:tcMar>
+            <w:vAlign w:val="center"/>
+          </w:tcPr>
+          <w:p>
+            <w:pPr>
+              <w:spacing w:after="0" w:line="252" w:lineRule="auto"/>
+              <w:jc w:val="left"/>
+            </w:pPr>
+            <w:r>
+              <w:rPr>
+                <w:sz w:val="18"/>
+              </w:rPr>
+              <w:t>2.050</w:t>
+            </w:r>
+          </w:p>
+        </w:tc>
+        <w:tc>
+          <w:tcPr>
+            <w:tcW w:type="dxa" w:w="1440"/>
+            <w:tcBorders>
+              <w:top w:val="single" w:sz="6" w:color="D9D9D9"/>
+              <w:left w:val="single" w:sz="6" w:color="D9D9D9"/>
+              <w:bottom w:val="single" w:sz="6" w:color="D9D9D9"/>
+              <w:right w:val="single" w:sz="6" w:color="D9D9D9"/>
+              <w:insideH w:val="single" w:sz="6" w:color="D9D9D9"/>
+              <w:insideV w:val="single" w:sz="6" w:color="D9D9D9"/>
+            </w:tcBorders>
+            <w:tcMar>
+              <w:top w:w="90" w:type="dxa"/>
+              <w:start w:w="110" w:type="dxa"/>
+              <w:bottom w:w="90" w:type="dxa"/>
+              <w:end w:w="110" w:type="dxa"/>
+            </w:tcMar>
+            <w:vAlign w:val="center"/>
+          </w:tcPr>
+          <w:p>
+            <w:pPr>
+              <w:spacing w:after="0" w:line="252" w:lineRule="auto"/>
+              <w:jc w:val="left"/>
+            </w:pPr>
+            <w:r>
+              <w:rPr>
+                <w:sz w:val="18"/>
+              </w:rPr>
+              <w:t>57,4%</w:t>
+            </w:r>
+          </w:p>
+        </w:tc>
+        <w:tc>
+          <w:tcPr>
+            <w:tcW w:type="dxa" w:w="1512"/>
+            <w:tcBorders>
+              <w:top w:val="single" w:sz="6" w:color="D9D9D9"/>
+              <w:left w:val="single" w:sz="6" w:color="D9D9D9"/>
+              <w:bottom w:val="single" w:sz="6" w:color="D9D9D9"/>
+              <w:right w:val="single" w:sz="6" w:color="D9D9D9"/>
+              <w:insideH w:val="single" w:sz="6" w:color="D9D9D9"/>
+              <w:insideV w:val="single" w:sz="6" w:color="D9D9D9"/>
+            </w:tcBorders>
+            <w:tcMar>
+              <w:top w:w="90" w:type="dxa"/>
+              <w:start w:w="110" w:type="dxa"/>
+              <w:bottom w:w="90" w:type="dxa"/>
+              <w:end w:w="110" w:type="dxa"/>
+            </w:tcMar>
+            <w:vAlign w:val="center"/>
+          </w:tcPr>
+          <w:p>
+            <w:pPr>
+              <w:spacing w:after="0" w:line="252" w:lineRule="auto"/>
+              <w:jc w:val="left"/>
+            </w:pPr>
+            <w:r>
+              <w:rPr>
+                <w:sz w:val="18"/>
+              </w:rPr>
+              <w:t>499</w:t>
+            </w:r>
+          </w:p>
+        </w:tc>
+      </w:tr>
+      <w:tr>
+        <w:trPr>
+          <w:cantSplit w:val="true"/>
+        </w:trPr>
+        <w:tc>
+          <w:tcPr>
+            <w:tcW w:type="dxa" w:w="3816"/>
+            <w:tcBorders>
+              <w:top w:val="single" w:sz="6" w:color="D9D9D9"/>
+              <w:left w:val="single" w:sz="6" w:color="D9D9D9"/>
+              <w:bottom w:val="single" w:sz="6" w:color="D9D9D9"/>
+              <w:right w:val="single" w:sz="6" w:color="D9D9D9"/>
+              <w:insideH w:val="single" w:sz="6" w:color="D9D9D9"/>
+              <w:insideV w:val="single" w:sz="6" w:color="D9D9D9"/>
+            </w:tcBorders>
+            <w:tcMar>
+              <w:top w:w="90" w:type="dxa"/>
+              <w:start w:w="110" w:type="dxa"/>
+              <w:bottom w:w="90" w:type="dxa"/>
+              <w:end w:w="110" w:type="dxa"/>
+            </w:tcMar>
+            <w:shd w:fill="F2F2F2"/>
+            <w:vAlign w:val="center"/>
+          </w:tcPr>
+          <w:p>
+            <w:pPr>
+              <w:spacing w:after="0" w:line="252" w:lineRule="auto"/>
+              <w:jc w:val="left"/>
+            </w:pPr>
+            <w:r>
+              <w:rPr>
+                <w:sz w:val="18"/>
+              </w:rPr>
+              <w:t>Critério estrito: declarado + confirmado</w:t>
+            </w:r>
+          </w:p>
+        </w:tc>
+        <w:tc>
+          <w:tcPr>
+            <w:tcW w:type="dxa" w:w="1224"/>
+            <w:tcBorders>
+              <w:top w:val="single" w:sz="6" w:color="D9D9D9"/>
+              <w:left w:val="single" w:sz="6" w:color="D9D9D9"/>
+              <w:bottom w:val="single" w:sz="6" w:color="D9D9D9"/>
+              <w:right w:val="single" w:sz="6" w:color="D9D9D9"/>
+              <w:insideH w:val="single" w:sz="6" w:color="D9D9D9"/>
+              <w:insideV w:val="single" w:sz="6" w:color="D9D9D9"/>
+            </w:tcBorders>
+            <w:tcMar>
+              <w:top w:w="90" w:type="dxa"/>
+              <w:start w:w="110" w:type="dxa"/>
+              <w:bottom w:w="90" w:type="dxa"/>
+              <w:end w:w="110" w:type="dxa"/>
+            </w:tcMar>
+            <w:shd w:fill="F2F2F2"/>
+            <w:vAlign w:val="center"/>
+          </w:tcPr>
+          <w:p>
+            <w:pPr>
+              <w:spacing w:after="0" w:line="252" w:lineRule="auto"/>
+              <w:jc w:val="left"/>
+            </w:pPr>
+            <w:r>
+              <w:rPr>
+                <w:sz w:val="18"/>
+              </w:rPr>
+              <w:t>2.698</w:t>
+            </w:r>
+          </w:p>
+        </w:tc>
+        <w:tc>
+          <w:tcPr>
+            <w:tcW w:type="dxa" w:w="1440"/>
+            <w:tcBorders>
+              <w:top w:val="single" w:sz="6" w:color="D9D9D9"/>
+              <w:left w:val="single" w:sz="6" w:color="D9D9D9"/>
+              <w:bottom w:val="single" w:sz="6" w:color="D9D9D9"/>
+              <w:right w:val="single" w:sz="6" w:color="D9D9D9"/>
+              <w:insideH w:val="single" w:sz="6" w:color="D9D9D9"/>
+              <w:insideV w:val="single" w:sz="6" w:color="D9D9D9"/>
+            </w:tcBorders>
+            <w:tcMar>
+              <w:top w:w="90" w:type="dxa"/>
+              <w:start w:w="110" w:type="dxa"/>
+              <w:bottom w:w="90" w:type="dxa"/>
+              <w:end w:w="110" w:type="dxa"/>
+            </w:tcMar>
+            <w:shd w:fill="F2F2F2"/>
+            <w:vAlign w:val="center"/>
+          </w:tcPr>
+          <w:p>
+            <w:pPr>
+              <w:spacing w:after="0" w:line="252" w:lineRule="auto"/>
+              <w:jc w:val="left"/>
+            </w:pPr>
+            <w:r>
+              <w:rPr>
+                <w:sz w:val="18"/>
+              </w:rPr>
+              <w:t>1.496</w:t>
+            </w:r>
+          </w:p>
+        </w:tc>
+        <w:tc>
+          <w:tcPr>
+            <w:tcW w:type="dxa" w:w="1440"/>
+            <w:tcBorders>
+              <w:top w:val="single" w:sz="6" w:color="D9D9D9"/>
+              <w:left w:val="single" w:sz="6" w:color="D9D9D9"/>
+              <w:bottom w:val="single" w:sz="6" w:color="D9D9D9"/>
+              <w:right w:val="single" w:sz="6" w:color="D9D9D9"/>
+              <w:insideH w:val="single" w:sz="6" w:color="D9D9D9"/>
+              <w:insideV w:val="single" w:sz="6" w:color="D9D9D9"/>
+            </w:tcBorders>
+            <w:tcMar>
+              <w:top w:w="90" w:type="dxa"/>
+              <w:start w:w="110" w:type="dxa"/>
+              <w:bottom w:w="90" w:type="dxa"/>
+              <w:end w:w="110" w:type="dxa"/>
+            </w:tcMar>
+            <w:shd w:fill="F2F2F2"/>
+            <w:vAlign w:val="center"/>
+          </w:tcPr>
+          <w:p>
+            <w:pPr>
+              <w:spacing w:after="0" w:line="252" w:lineRule="auto"/>
+              <w:jc w:val="left"/>
+            </w:pPr>
+            <w:r>
+              <w:rPr>
+                <w:sz w:val="18"/>
+              </w:rPr>
+              <w:t>55,4%</w:t>
+            </w:r>
+          </w:p>
+        </w:tc>
+        <w:tc>
+          <w:tcPr>
+            <w:tcW w:type="dxa" w:w="1512"/>
+            <w:tcBorders>
+              <w:top w:val="single" w:sz="6" w:color="D9D9D9"/>
+              <w:left w:val="single" w:sz="6" w:color="D9D9D9"/>
+              <w:bottom w:val="single" w:sz="6" w:color="D9D9D9"/>
+              <w:right w:val="single" w:sz="6" w:color="D9D9D9"/>
+              <w:insideH w:val="single" w:sz="6" w:color="D9D9D9"/>
+              <w:insideV w:val="single" w:sz="6" w:color="D9D9D9"/>
+            </w:tcBorders>
+            <w:tcMar>
+              <w:top w:w="90" w:type="dxa"/>
+              <w:start w:w="110" w:type="dxa"/>
+              <w:bottom w:w="90" w:type="dxa"/>
+              <w:end w:w="110" w:type="dxa"/>
+            </w:tcMar>
+            <w:shd w:fill="F2F2F2"/>
+            <w:vAlign w:val="center"/>
+          </w:tcPr>
+          <w:p>
+            <w:pPr>
+              <w:spacing w:after="0" w:line="252" w:lineRule="auto"/>
+              <w:jc w:val="left"/>
+            </w:pPr>
+            <w:r>
+              <w:rPr>
+                <w:sz w:val="18"/>
+              </w:rPr>
+              <w:t>—</w:t>
+            </w:r>
+          </w:p>
+        </w:tc>
+      </w:tr>
+    </w:tbl>
+    <w:p>
+      <w:pPr>
+        <w:spacing w:after="0"/>
+      </w:pPr>
+    </w:p>
+    <w:p>
+      <w:r>
+        <w:t>Entre as 2.050 revistas identificadas como OJS e preservadas, 1.551 aparecem em uma agência e 499 em duas ou mais agências.</w:t>
+      </w:r>
     </w:p>
     <w:p>
       <w:r>
@@ -5485,7 +6709,7 @@
               <w:rPr>
                 <w:sz w:val="18"/>
               </w:rPr>
-              <w:t>2a98d7d62572963dfcf52d7680084586fb75b96ffb6caa4044890a97148f3a7e</w:t>
+              <w:t>77b4a67f1cedea3a17fe920391b8c78792da0b4f2e6535f92483bbb5cba0ef12</w:t>
             </w:r>
           </w:p>
         </w:tc>
@@ -5905,7 +7129,7 @@
               <w:rPr>
                 <w:sz w:val="18"/>
               </w:rPr>
-              <w:t>b1283072e3616c16bed800259671e57db786e9b9b8960b628539564f78e9af78</w:t>
+              <w:t>394ce318114f897491fbfaa37e510cd119795bfb4303282ee57d61e52f5aa13f</w:t>
             </w:r>
           </w:p>
         </w:tc>
@@ -5974,7 +7198,7 @@
               <w:rPr>
                 <w:sz w:val="18"/>
               </w:rPr>
-              <w:t>68c84ada9ce20f380c7010d815e1a942a1d0830b82e6f67648cad5d22ef70d3c</w:t>
+              <w:t>39627b24a677d70ea5e1853910d2cafff491800a6fa03f108e60903e88053e45</w:t>
             </w:r>
           </w:p>
         </w:tc>

</xml_diff>